<commit_message>
Re-run with corrected groups
</commit_message>
<xml_diff>
--- a/Tables/Updated/VBT_Predictive_Factors_Table5_part1.docx
+++ b/Tables/Updated/VBT_Predictive_Factors_Table5_part1.docx
@@ -609,7 +609,7 @@
                 <w:szCs w:val="18"/>
                 <w:color w:val="000000"/>
               </w:rPr>
-              <w:t xml:space="preserve">269</w:t>
+              <w:t xml:space="preserve">283</w:t>
             </w:r>
           </w:p>
         </w:tc>
@@ -662,7 +662,7 @@
                 <w:szCs w:val="18"/>
                 <w:color w:val="000000"/>
               </w:rPr>
-              <w:t xml:space="preserve">130</w:t>
+              <w:t xml:space="preserve">128</w:t>
             </w:r>
           </w:p>
         </w:tc>
@@ -715,7 +715,7 @@
                 <w:szCs w:val="18"/>
                 <w:color w:val="000000"/>
               </w:rPr>
-              <w:t xml:space="preserve">61</w:t>
+              <w:t xml:space="preserve">63</w:t>
             </w:r>
           </w:p>
         </w:tc>
@@ -1092,6 +1092,59 @@
                 <w:szCs w:val="18"/>
                 <w:color w:val="000000"/>
               </w:rPr>
+              <w:t xml:space="preserve">57.00 [54.83, 57.00]</w:t>
+            </w:r>
+          </w:p>
+        </w:tc>
+        <w:tc>
+          <w:tcPr>
+            <w:tcBorders>
+              <w:bottom w:val="single" w:sz="6" w:space="0" w:color="666666"/>
+              <w:top w:val="single" w:sz="6" w:space="0" w:color="666666"/>
+              <w:left w:val="none" w:sz="0" w:space="0" w:color="000000"/>
+              <w:right w:val="none" w:sz="0" w:space="0" w:color="000000"/>
+            </w:tcBorders>
+            <w:shd w:val="clear" w:color="auto" w:fill="FFFFFF"/>
+            <w:tcMar>
+              <w:top w:w="0" w:type="dxa"/>
+              <w:bottom w:w="0" w:type="dxa"/>
+              <w:left w:w="0" w:type="dxa"/>
+              <w:right w:w="0" w:type="dxa"/>
+            </w:tcMar>
+            <w:vAlign w:val="center"/>
+          </w:tcPr>
+          <w:p>
+            <w:pPr>
+              <w:pStyle w:val="Normal"/>
+              <w:jc w:val="left"/>
+              <w:pBdr>
+                <w:bottom w:val="none" w:sz="0" w:space="0" w:color="000000"/>
+                <w:top w:val="none" w:sz="0" w:space="0" w:color="000000"/>
+                <w:left w:val="none" w:sz="0" w:space="0" w:color="000000"/>
+                <w:right w:val="none" w:sz="0" w:space="0" w:color="000000"/>
+              </w:pBdr>
+              <w:spacing w:after="100" w:before="100" w:line="240"/>
+              <w:ind w:left="100" w:right="100" w:firstLine="0" w:firstLineChars="0"/>
+              <w:rPr>
+                <w:rFonts w:ascii="Arial" w:hAnsi="Arial" w:eastAsia="Arial" w:cs="Arial"/>
+                <w:i w:val="false"/>
+                <w:b w:val="false"/>
+                <w:u w:val="none"/>
+                <w:sz w:val="18"/>
+                <w:szCs w:val="18"/>
+                <w:color w:val="000000"/>
+              </w:rPr>
+            </w:pPr>
+            <w:r>
+              <w:rPr>
+                <w:rFonts w:ascii="Arial" w:hAnsi="Arial" w:eastAsia="Arial" w:cs="Arial"/>
+                <w:i w:val="false"/>
+                <w:b w:val="false"/>
+                <w:u w:val="none"/>
+                <w:sz w:val="18"/>
+                <w:szCs w:val="18"/>
+                <w:color w:val="000000"/>
+              </w:rPr>
               <w:t xml:space="preserve">57.00 [57.00, 57.00]</w:t>
             </w:r>
           </w:p>
@@ -1145,59 +1198,6 @@
                 <w:szCs w:val="18"/>
                 <w:color w:val="000000"/>
               </w:rPr>
-              <w:t xml:space="preserve">57.00 [57.00, 57.00]</w:t>
-            </w:r>
-          </w:p>
-        </w:tc>
-        <w:tc>
-          <w:tcPr>
-            <w:tcBorders>
-              <w:bottom w:val="single" w:sz="6" w:space="0" w:color="666666"/>
-              <w:top w:val="single" w:sz="6" w:space="0" w:color="666666"/>
-              <w:left w:val="none" w:sz="0" w:space="0" w:color="000000"/>
-              <w:right w:val="none" w:sz="0" w:space="0" w:color="000000"/>
-            </w:tcBorders>
-            <w:shd w:val="clear" w:color="auto" w:fill="FFFFFF"/>
-            <w:tcMar>
-              <w:top w:w="0" w:type="dxa"/>
-              <w:bottom w:w="0" w:type="dxa"/>
-              <w:left w:w="0" w:type="dxa"/>
-              <w:right w:w="0" w:type="dxa"/>
-            </w:tcMar>
-            <w:vAlign w:val="center"/>
-          </w:tcPr>
-          <w:p>
-            <w:pPr>
-              <w:pStyle w:val="Normal"/>
-              <w:jc w:val="left"/>
-              <w:pBdr>
-                <w:bottom w:val="none" w:sz="0" w:space="0" w:color="000000"/>
-                <w:top w:val="none" w:sz="0" w:space="0" w:color="000000"/>
-                <w:left w:val="none" w:sz="0" w:space="0" w:color="000000"/>
-                <w:right w:val="none" w:sz="0" w:space="0" w:color="000000"/>
-              </w:pBdr>
-              <w:spacing w:after="100" w:before="100" w:line="240"/>
-              <w:ind w:left="100" w:right="100" w:firstLine="0" w:firstLineChars="0"/>
-              <w:rPr>
-                <w:rFonts w:ascii="Arial" w:hAnsi="Arial" w:eastAsia="Arial" w:cs="Arial"/>
-                <w:i w:val="false"/>
-                <w:b w:val="false"/>
-                <w:u w:val="none"/>
-                <w:sz w:val="18"/>
-                <w:szCs w:val="18"/>
-                <w:color w:val="000000"/>
-              </w:rPr>
-            </w:pPr>
-            <w:r>
-              <w:rPr>
-                <w:rFonts w:ascii="Arial" w:hAnsi="Arial" w:eastAsia="Arial" w:cs="Arial"/>
-                <w:i w:val="false"/>
-                <w:b w:val="false"/>
-                <w:u w:val="none"/>
-                <w:sz w:val="18"/>
-                <w:szCs w:val="18"/>
-                <w:color w:val="000000"/>
-              </w:rPr>
               <w:t xml:space="preserve">&lt;0.001</w:t>
             </w:r>
           </w:p>
@@ -1304,7 +1304,7 @@
                 <w:szCs w:val="18"/>
                 <w:color w:val="000000"/>
               </w:rPr>
-              <w:t xml:space="preserve">0.012</w:t>
+              <w:t xml:space="preserve">0.006</w:t>
             </w:r>
           </w:p>
         </w:tc>
@@ -1575,7 +1575,7 @@
                 <w:szCs w:val="18"/>
                 <w:color w:val="000000"/>
               </w:rPr>
-              <w:t xml:space="preserve">53.70 [48.00, 59.50]</w:t>
+              <w:t xml:space="preserve">53.70 [48.00, 58.60]</w:t>
             </w:r>
           </w:p>
         </w:tc>
@@ -1899,7 +1899,7 @@
                 <w:szCs w:val="18"/>
                 <w:color w:val="000000"/>
               </w:rPr>
-              <w:t xml:space="preserve">49.00 [41.00, 55.70]</w:t>
+              <w:t xml:space="preserve">49.00 [41.00, 57.30]</w:t>
             </w:r>
           </w:p>
         </w:tc>
@@ -2005,7 +2005,7 @@
                 <w:szCs w:val="18"/>
                 <w:color w:val="000000"/>
               </w:rPr>
-              <w:t xml:space="preserve">49.00 [41.00, 51.80]</w:t>
+              <w:t xml:space="preserve">41.00 [41.00, 51.80]</w:t>
             </w:r>
           </w:p>
         </w:tc>
@@ -2164,7 +2164,7 @@
                 <w:szCs w:val="18"/>
                 <w:color w:val="000000"/>
               </w:rPr>
-              <w:t xml:space="preserve">&lt;0.001</w:t>
+              <w:t xml:space="preserve">0.001</w:t>
             </w:r>
           </w:p>
         </w:tc>
@@ -2382,7 +2382,7 @@
                 <w:szCs w:val="18"/>
                 <w:color w:val="000000"/>
               </w:rPr>
-              <w:t xml:space="preserve">55.10 [48.60, 60.70]</w:t>
+              <w:t xml:space="preserve">54.10 [48.60, 60.70]</w:t>
             </w:r>
           </w:p>
         </w:tc>
@@ -2594,7 +2594,7 @@
                 <w:szCs w:val="18"/>
                 <w:color w:val="000000"/>
               </w:rPr>
-              <w:t xml:space="preserve">0.030</w:t>
+              <w:t xml:space="preserve">0.111</w:t>
             </w:r>
           </w:p>
         </w:tc>
@@ -2812,60 +2812,60 @@
                 <w:szCs w:val="18"/>
                 <w:color w:val="000000"/>
               </w:rPr>
-              <w:t xml:space="preserve">52.40 [46.75, 56.10]</w:t>
-            </w:r>
-          </w:p>
-        </w:tc>
-        <w:tc>
-          <w:tcPr>
-            <w:tcBorders>
-              <w:bottom w:val="single" w:sz="6" w:space="0" w:color="666666"/>
-              <w:top w:val="single" w:sz="6" w:space="0" w:color="666666"/>
-              <w:left w:val="none" w:sz="0" w:space="0" w:color="000000"/>
-              <w:right w:val="none" w:sz="0" w:space="0" w:color="000000"/>
-            </w:tcBorders>
-            <w:shd w:val="clear" w:color="auto" w:fill="FFFFFF"/>
-            <w:tcMar>
-              <w:top w:w="0" w:type="dxa"/>
-              <w:bottom w:w="0" w:type="dxa"/>
-              <w:left w:w="0" w:type="dxa"/>
-              <w:right w:w="0" w:type="dxa"/>
-            </w:tcMar>
-            <w:vAlign w:val="center"/>
-          </w:tcPr>
-          <w:p>
-            <w:pPr>
-              <w:pStyle w:val="Normal"/>
-              <w:jc w:val="left"/>
-              <w:pBdr>
-                <w:bottom w:val="none" w:sz="0" w:space="0" w:color="000000"/>
-                <w:top w:val="none" w:sz="0" w:space="0" w:color="000000"/>
-                <w:left w:val="none" w:sz="0" w:space="0" w:color="000000"/>
-                <w:right w:val="none" w:sz="0" w:space="0" w:color="000000"/>
-              </w:pBdr>
-              <w:spacing w:after="100" w:before="100" w:line="240"/>
-              <w:ind w:left="100" w:right="100" w:firstLine="0" w:firstLineChars="0"/>
-              <w:rPr>
-                <w:rFonts w:ascii="Arial" w:hAnsi="Arial" w:eastAsia="Arial" w:cs="Arial"/>
-                <w:i w:val="false"/>
-                <w:b w:val="false"/>
-                <w:u w:val="none"/>
-                <w:sz w:val="18"/>
-                <w:szCs w:val="18"/>
-                <w:color w:val="000000"/>
-              </w:rPr>
-            </w:pPr>
-            <w:r>
-              <w:rPr>
-                <w:rFonts w:ascii="Arial" w:hAnsi="Arial" w:eastAsia="Arial" w:cs="Arial"/>
-                <w:i w:val="false"/>
-                <w:b w:val="false"/>
-                <w:u w:val="none"/>
-                <w:sz w:val="18"/>
-                <w:szCs w:val="18"/>
-                <w:color w:val="000000"/>
-              </w:rPr>
-              <w:t xml:space="preserve">48.40 [43.80, 52.40]</w:t>
+              <w:t xml:space="preserve">52.40 [48.40, 56.10]</w:t>
+            </w:r>
+          </w:p>
+        </w:tc>
+        <w:tc>
+          <w:tcPr>
+            <w:tcBorders>
+              <w:bottom w:val="single" w:sz="6" w:space="0" w:color="666666"/>
+              <w:top w:val="single" w:sz="6" w:space="0" w:color="666666"/>
+              <w:left w:val="none" w:sz="0" w:space="0" w:color="000000"/>
+              <w:right w:val="none" w:sz="0" w:space="0" w:color="000000"/>
+            </w:tcBorders>
+            <w:shd w:val="clear" w:color="auto" w:fill="FFFFFF"/>
+            <w:tcMar>
+              <w:top w:w="0" w:type="dxa"/>
+              <w:bottom w:w="0" w:type="dxa"/>
+              <w:left w:w="0" w:type="dxa"/>
+              <w:right w:w="0" w:type="dxa"/>
+            </w:tcMar>
+            <w:vAlign w:val="center"/>
+          </w:tcPr>
+          <w:p>
+            <w:pPr>
+              <w:pStyle w:val="Normal"/>
+              <w:jc w:val="left"/>
+              <w:pBdr>
+                <w:bottom w:val="none" w:sz="0" w:space="0" w:color="000000"/>
+                <w:top w:val="none" w:sz="0" w:space="0" w:color="000000"/>
+                <w:left w:val="none" w:sz="0" w:space="0" w:color="000000"/>
+                <w:right w:val="none" w:sz="0" w:space="0" w:color="000000"/>
+              </w:pBdr>
+              <w:spacing w:after="100" w:before="100" w:line="240"/>
+              <w:ind w:left="100" w:right="100" w:firstLine="0" w:firstLineChars="0"/>
+              <w:rPr>
+                <w:rFonts w:ascii="Arial" w:hAnsi="Arial" w:eastAsia="Arial" w:cs="Arial"/>
+                <w:i w:val="false"/>
+                <w:b w:val="false"/>
+                <w:u w:val="none"/>
+                <w:sz w:val="18"/>
+                <w:szCs w:val="18"/>
+                <w:color w:val="000000"/>
+              </w:rPr>
+            </w:pPr>
+            <w:r>
+              <w:rPr>
+                <w:rFonts w:ascii="Arial" w:hAnsi="Arial" w:eastAsia="Arial" w:cs="Arial"/>
+                <w:i w:val="false"/>
+                <w:b w:val="false"/>
+                <w:u w:val="none"/>
+                <w:sz w:val="18"/>
+                <w:szCs w:val="18"/>
+                <w:color w:val="000000"/>
+              </w:rPr>
+              <w:t xml:space="preserve">48.40 [42.45, 51.45]</w:t>
             </w:r>
           </w:p>
         </w:tc>
@@ -3024,7 +3024,7 @@
                 <w:szCs w:val="18"/>
                 <w:color w:val="000000"/>
               </w:rPr>
-              <w:t xml:space="preserve">0.018</w:t>
+              <w:t xml:space="preserve">0.009</w:t>
             </w:r>
           </w:p>
         </w:tc>
@@ -3242,7 +3242,7 @@
                 <w:szCs w:val="18"/>
                 <w:color w:val="000000"/>
               </w:rPr>
-              <w:t xml:space="preserve">51.90 [46.68, 58.30]</w:t>
+              <w:t xml:space="preserve">51.90 [46.20, 58.30]</w:t>
             </w:r>
           </w:p>
         </w:tc>
@@ -3884,7 +3884,7 @@
                 <w:szCs w:val="18"/>
                 <w:color w:val="000000"/>
               </w:rPr>
-              <w:t xml:space="preserve">0.005</w:t>
+              <w:t xml:space="preserve">0.006</w:t>
             </w:r>
           </w:p>
         </w:tc>
@@ -4314,7 +4314,7 @@
                 <w:szCs w:val="18"/>
                 <w:color w:val="000000"/>
               </w:rPr>
-              <w:t xml:space="preserve">0.011</w:t>
+              <w:t xml:space="preserve">0.006</w:t>
             </w:r>
           </w:p>
         </w:tc>
@@ -4585,7 +4585,7 @@
                 <w:szCs w:val="18"/>
                 <w:color w:val="000000"/>
               </w:rPr>
-              <w:t xml:space="preserve">0.00 [0.00, 1.00]</w:t>
+              <w:t xml:space="preserve">0.00 [0.00, 0.50]</w:t>
             </w:r>
           </w:p>
         </w:tc>
@@ -4909,113 +4909,113 @@
                 <w:szCs w:val="18"/>
                 <w:color w:val="000000"/>
               </w:rPr>
-              <w:t xml:space="preserve">0.55 [0.39, 0.68]</w:t>
-            </w:r>
-          </w:p>
-        </w:tc>
-        <w:tc>
-          <w:tcPr>
-            <w:tcBorders>
-              <w:bottom w:val="single" w:sz="6" w:space="0" w:color="666666"/>
-              <w:top w:val="single" w:sz="6" w:space="0" w:color="666666"/>
-              <w:left w:val="none" w:sz="0" w:space="0" w:color="000000"/>
-              <w:right w:val="none" w:sz="0" w:space="0" w:color="000000"/>
-            </w:tcBorders>
-            <w:shd w:val="clear" w:color="auto" w:fill="FFFFFF"/>
-            <w:tcMar>
-              <w:top w:w="0" w:type="dxa"/>
-              <w:bottom w:w="0" w:type="dxa"/>
-              <w:left w:w="0" w:type="dxa"/>
-              <w:right w:w="0" w:type="dxa"/>
-            </w:tcMar>
-            <w:vAlign w:val="center"/>
-          </w:tcPr>
-          <w:p>
-            <w:pPr>
-              <w:pStyle w:val="Normal"/>
-              <w:jc w:val="left"/>
-              <w:pBdr>
-                <w:bottom w:val="none" w:sz="0" w:space="0" w:color="000000"/>
-                <w:top w:val="none" w:sz="0" w:space="0" w:color="000000"/>
-                <w:left w:val="none" w:sz="0" w:space="0" w:color="000000"/>
-                <w:right w:val="none" w:sz="0" w:space="0" w:color="000000"/>
-              </w:pBdr>
-              <w:spacing w:after="100" w:before="100" w:line="240"/>
-              <w:ind w:left="100" w:right="100" w:firstLine="0" w:firstLineChars="0"/>
-              <w:rPr>
-                <w:rFonts w:ascii="Arial" w:hAnsi="Arial" w:eastAsia="Arial" w:cs="Arial"/>
-                <w:i w:val="false"/>
-                <w:b w:val="false"/>
-                <w:u w:val="none"/>
-                <w:sz w:val="18"/>
-                <w:szCs w:val="18"/>
-                <w:color w:val="000000"/>
-              </w:rPr>
-            </w:pPr>
-            <w:r>
-              <w:rPr>
-                <w:rFonts w:ascii="Arial" w:hAnsi="Arial" w:eastAsia="Arial" w:cs="Arial"/>
-                <w:i w:val="false"/>
-                <w:b w:val="false"/>
-                <w:u w:val="none"/>
-                <w:sz w:val="18"/>
-                <w:szCs w:val="18"/>
-                <w:color w:val="000000"/>
-              </w:rPr>
-              <w:t xml:space="preserve">0.44 [0.29, 0.59]</w:t>
-            </w:r>
-          </w:p>
-        </w:tc>
-        <w:tc>
-          <w:tcPr>
-            <w:tcBorders>
-              <w:bottom w:val="single" w:sz="6" w:space="0" w:color="666666"/>
-              <w:top w:val="single" w:sz="6" w:space="0" w:color="666666"/>
-              <w:left w:val="none" w:sz="0" w:space="0" w:color="000000"/>
-              <w:right w:val="none" w:sz="0" w:space="0" w:color="000000"/>
-            </w:tcBorders>
-            <w:shd w:val="clear" w:color="auto" w:fill="FFFFFF"/>
-            <w:tcMar>
-              <w:top w:w="0" w:type="dxa"/>
-              <w:bottom w:w="0" w:type="dxa"/>
-              <w:left w:w="0" w:type="dxa"/>
-              <w:right w:w="0" w:type="dxa"/>
-            </w:tcMar>
-            <w:vAlign w:val="center"/>
-          </w:tcPr>
-          <w:p>
-            <w:pPr>
-              <w:pStyle w:val="Normal"/>
-              <w:jc w:val="left"/>
-              <w:pBdr>
-                <w:bottom w:val="none" w:sz="0" w:space="0" w:color="000000"/>
-                <w:top w:val="none" w:sz="0" w:space="0" w:color="000000"/>
-                <w:left w:val="none" w:sz="0" w:space="0" w:color="000000"/>
-                <w:right w:val="none" w:sz="0" w:space="0" w:color="000000"/>
-              </w:pBdr>
-              <w:spacing w:after="100" w:before="100" w:line="240"/>
-              <w:ind w:left="100" w:right="100" w:firstLine="0" w:firstLineChars="0"/>
-              <w:rPr>
-                <w:rFonts w:ascii="Arial" w:hAnsi="Arial" w:eastAsia="Arial" w:cs="Arial"/>
-                <w:i w:val="false"/>
-                <w:b w:val="false"/>
-                <w:u w:val="none"/>
-                <w:sz w:val="18"/>
-                <w:szCs w:val="18"/>
-                <w:color w:val="000000"/>
-              </w:rPr>
-            </w:pPr>
-            <w:r>
-              <w:rPr>
-                <w:rFonts w:ascii="Arial" w:hAnsi="Arial" w:eastAsia="Arial" w:cs="Arial"/>
-                <w:i w:val="false"/>
-                <w:b w:val="false"/>
-                <w:u w:val="none"/>
-                <w:sz w:val="18"/>
-                <w:szCs w:val="18"/>
-                <w:color w:val="000000"/>
-              </w:rPr>
-              <w:t xml:space="preserve">0.64 [0.56, 0.73]</w:t>
+              <w:t xml:space="preserve">0.53 [0.38, 0.68]</w:t>
+            </w:r>
+          </w:p>
+        </w:tc>
+        <w:tc>
+          <w:tcPr>
+            <w:tcBorders>
+              <w:bottom w:val="single" w:sz="6" w:space="0" w:color="666666"/>
+              <w:top w:val="single" w:sz="6" w:space="0" w:color="666666"/>
+              <w:left w:val="none" w:sz="0" w:space="0" w:color="000000"/>
+              <w:right w:val="none" w:sz="0" w:space="0" w:color="000000"/>
+            </w:tcBorders>
+            <w:shd w:val="clear" w:color="auto" w:fill="FFFFFF"/>
+            <w:tcMar>
+              <w:top w:w="0" w:type="dxa"/>
+              <w:bottom w:w="0" w:type="dxa"/>
+              <w:left w:w="0" w:type="dxa"/>
+              <w:right w:w="0" w:type="dxa"/>
+            </w:tcMar>
+            <w:vAlign w:val="center"/>
+          </w:tcPr>
+          <w:p>
+            <w:pPr>
+              <w:pStyle w:val="Normal"/>
+              <w:jc w:val="left"/>
+              <w:pBdr>
+                <w:bottom w:val="none" w:sz="0" w:space="0" w:color="000000"/>
+                <w:top w:val="none" w:sz="0" w:space="0" w:color="000000"/>
+                <w:left w:val="none" w:sz="0" w:space="0" w:color="000000"/>
+                <w:right w:val="none" w:sz="0" w:space="0" w:color="000000"/>
+              </w:pBdr>
+              <w:spacing w:after="100" w:before="100" w:line="240"/>
+              <w:ind w:left="100" w:right="100" w:firstLine="0" w:firstLineChars="0"/>
+              <w:rPr>
+                <w:rFonts w:ascii="Arial" w:hAnsi="Arial" w:eastAsia="Arial" w:cs="Arial"/>
+                <w:i w:val="false"/>
+                <w:b w:val="false"/>
+                <w:u w:val="none"/>
+                <w:sz w:val="18"/>
+                <w:szCs w:val="18"/>
+                <w:color w:val="000000"/>
+              </w:rPr>
+            </w:pPr>
+            <w:r>
+              <w:rPr>
+                <w:rFonts w:ascii="Arial" w:hAnsi="Arial" w:eastAsia="Arial" w:cs="Arial"/>
+                <w:i w:val="false"/>
+                <w:b w:val="false"/>
+                <w:u w:val="none"/>
+                <w:sz w:val="18"/>
+                <w:szCs w:val="18"/>
+                <w:color w:val="000000"/>
+              </w:rPr>
+              <w:t xml:space="preserve">0.44 [0.29, 0.60]</w:t>
+            </w:r>
+          </w:p>
+        </w:tc>
+        <w:tc>
+          <w:tcPr>
+            <w:tcBorders>
+              <w:bottom w:val="single" w:sz="6" w:space="0" w:color="666666"/>
+              <w:top w:val="single" w:sz="6" w:space="0" w:color="666666"/>
+              <w:left w:val="none" w:sz="0" w:space="0" w:color="000000"/>
+              <w:right w:val="none" w:sz="0" w:space="0" w:color="000000"/>
+            </w:tcBorders>
+            <w:shd w:val="clear" w:color="auto" w:fill="FFFFFF"/>
+            <w:tcMar>
+              <w:top w:w="0" w:type="dxa"/>
+              <w:bottom w:w="0" w:type="dxa"/>
+              <w:left w:w="0" w:type="dxa"/>
+              <w:right w:w="0" w:type="dxa"/>
+            </w:tcMar>
+            <w:vAlign w:val="center"/>
+          </w:tcPr>
+          <w:p>
+            <w:pPr>
+              <w:pStyle w:val="Normal"/>
+              <w:jc w:val="left"/>
+              <w:pBdr>
+                <w:bottom w:val="none" w:sz="0" w:space="0" w:color="000000"/>
+                <w:top w:val="none" w:sz="0" w:space="0" w:color="000000"/>
+                <w:left w:val="none" w:sz="0" w:space="0" w:color="000000"/>
+                <w:right w:val="none" w:sz="0" w:space="0" w:color="000000"/>
+              </w:pBdr>
+              <w:spacing w:after="100" w:before="100" w:line="240"/>
+              <w:ind w:left="100" w:right="100" w:firstLine="0" w:firstLineChars="0"/>
+              <w:rPr>
+                <w:rFonts w:ascii="Arial" w:hAnsi="Arial" w:eastAsia="Arial" w:cs="Arial"/>
+                <w:i w:val="false"/>
+                <w:b w:val="false"/>
+                <w:u w:val="none"/>
+                <w:sz w:val="18"/>
+                <w:szCs w:val="18"/>
+                <w:color w:val="000000"/>
+              </w:rPr>
+            </w:pPr>
+            <w:r>
+              <w:rPr>
+                <w:rFonts w:ascii="Arial" w:hAnsi="Arial" w:eastAsia="Arial" w:cs="Arial"/>
+                <w:i w:val="false"/>
+                <w:b w:val="false"/>
+                <w:u w:val="none"/>
+                <w:sz w:val="18"/>
+                <w:szCs w:val="18"/>
+                <w:color w:val="000000"/>
+              </w:rPr>
+              <w:t xml:space="preserve">0.65 [0.56, 0.74]</w:t>
             </w:r>
           </w:p>
         </w:tc>
@@ -5392,7 +5392,7 @@
                 <w:szCs w:val="18"/>
                 <w:color w:val="000000"/>
               </w:rPr>
-              <w:t xml:space="preserve">41.60 [37.92, 48.70]</w:t>
+              <w:t xml:space="preserve">41.60 [38.98, 48.70]</w:t>
             </w:r>
           </w:p>
         </w:tc>
@@ -5498,7 +5498,7 @@
                 <w:szCs w:val="18"/>
                 <w:color w:val="000000"/>
               </w:rPr>
-              <w:t xml:space="preserve">0.004</w:t>
+              <w:t xml:space="preserve">0.002</w:t>
             </w:r>
           </w:p>
         </w:tc>
@@ -5822,60 +5822,60 @@
                 <w:szCs w:val="18"/>
                 <w:color w:val="000000"/>
               </w:rPr>
-              <w:t xml:space="preserve">49.90 [43.30, 58.40]</w:t>
-            </w:r>
-          </w:p>
-        </w:tc>
-        <w:tc>
-          <w:tcPr>
-            <w:tcBorders>
-              <w:bottom w:val="single" w:sz="6" w:space="0" w:color="666666"/>
-              <w:top w:val="single" w:sz="6" w:space="0" w:color="666666"/>
-              <w:left w:val="none" w:sz="0" w:space="0" w:color="000000"/>
-              <w:right w:val="none" w:sz="0" w:space="0" w:color="000000"/>
-            </w:tcBorders>
-            <w:shd w:val="clear" w:color="auto" w:fill="FFFFFF"/>
-            <w:tcMar>
-              <w:top w:w="0" w:type="dxa"/>
-              <w:bottom w:w="0" w:type="dxa"/>
-              <w:left w:w="0" w:type="dxa"/>
-              <w:right w:w="0" w:type="dxa"/>
-            </w:tcMar>
-            <w:vAlign w:val="center"/>
-          </w:tcPr>
-          <w:p>
-            <w:pPr>
-              <w:pStyle w:val="Normal"/>
-              <w:jc w:val="left"/>
-              <w:pBdr>
-                <w:bottom w:val="none" w:sz="0" w:space="0" w:color="000000"/>
-                <w:top w:val="none" w:sz="0" w:space="0" w:color="000000"/>
-                <w:left w:val="none" w:sz="0" w:space="0" w:color="000000"/>
-                <w:right w:val="none" w:sz="0" w:space="0" w:color="000000"/>
-              </w:pBdr>
-              <w:spacing w:after="100" w:before="100" w:line="240"/>
-              <w:ind w:left="100" w:right="100" w:firstLine="0" w:firstLineChars="0"/>
-              <w:rPr>
-                <w:rFonts w:ascii="Arial" w:hAnsi="Arial" w:eastAsia="Arial" w:cs="Arial"/>
-                <w:i w:val="false"/>
-                <w:b w:val="false"/>
-                <w:u w:val="none"/>
-                <w:sz w:val="18"/>
-                <w:szCs w:val="18"/>
-                <w:color w:val="000000"/>
-              </w:rPr>
-            </w:pPr>
-            <w:r>
-              <w:rPr>
-                <w:rFonts w:ascii="Arial" w:hAnsi="Arial" w:eastAsia="Arial" w:cs="Arial"/>
-                <w:i w:val="false"/>
-                <w:b w:val="false"/>
-                <w:u w:val="none"/>
-                <w:sz w:val="18"/>
-                <w:szCs w:val="18"/>
-                <w:color w:val="000000"/>
-              </w:rPr>
-              <w:t xml:space="preserve">33.90 [33.90, 49.90]</w:t>
+              <w:t xml:space="preserve">49.90 [43.30, 58.85]</w:t>
+            </w:r>
+          </w:p>
+        </w:tc>
+        <w:tc>
+          <w:tcPr>
+            <w:tcBorders>
+              <w:bottom w:val="single" w:sz="6" w:space="0" w:color="666666"/>
+              <w:top w:val="single" w:sz="6" w:space="0" w:color="666666"/>
+              <w:left w:val="none" w:sz="0" w:space="0" w:color="000000"/>
+              <w:right w:val="none" w:sz="0" w:space="0" w:color="000000"/>
+            </w:tcBorders>
+            <w:shd w:val="clear" w:color="auto" w:fill="FFFFFF"/>
+            <w:tcMar>
+              <w:top w:w="0" w:type="dxa"/>
+              <w:bottom w:w="0" w:type="dxa"/>
+              <w:left w:w="0" w:type="dxa"/>
+              <w:right w:w="0" w:type="dxa"/>
+            </w:tcMar>
+            <w:vAlign w:val="center"/>
+          </w:tcPr>
+          <w:p>
+            <w:pPr>
+              <w:pStyle w:val="Normal"/>
+              <w:jc w:val="left"/>
+              <w:pBdr>
+                <w:bottom w:val="none" w:sz="0" w:space="0" w:color="000000"/>
+                <w:top w:val="none" w:sz="0" w:space="0" w:color="000000"/>
+                <w:left w:val="none" w:sz="0" w:space="0" w:color="000000"/>
+                <w:right w:val="none" w:sz="0" w:space="0" w:color="000000"/>
+              </w:pBdr>
+              <w:spacing w:after="100" w:before="100" w:line="240"/>
+              <w:ind w:left="100" w:right="100" w:firstLine="0" w:firstLineChars="0"/>
+              <w:rPr>
+                <w:rFonts w:ascii="Arial" w:hAnsi="Arial" w:eastAsia="Arial" w:cs="Arial"/>
+                <w:i w:val="false"/>
+                <w:b w:val="false"/>
+                <w:u w:val="none"/>
+                <w:sz w:val="18"/>
+                <w:szCs w:val="18"/>
+                <w:color w:val="000000"/>
+              </w:rPr>
+            </w:pPr>
+            <w:r>
+              <w:rPr>
+                <w:rFonts w:ascii="Arial" w:hAnsi="Arial" w:eastAsia="Arial" w:cs="Arial"/>
+                <w:i w:val="false"/>
+                <w:b w:val="false"/>
+                <w:u w:val="none"/>
+                <w:sz w:val="18"/>
+                <w:szCs w:val="18"/>
+                <w:color w:val="000000"/>
+              </w:rPr>
+              <w:t xml:space="preserve">33.90 [33.90, 49.10]</w:t>
             </w:r>
           </w:p>
         </w:tc>
@@ -6034,7 +6034,7 @@
                 <w:szCs w:val="18"/>
                 <w:color w:val="000000"/>
               </w:rPr>
-              <w:t xml:space="preserve">0.031</w:t>
+              <w:t xml:space="preserve">0.041</w:t>
             </w:r>
           </w:p>
         </w:tc>
@@ -6252,7 +6252,7 @@
                 <w:szCs w:val="18"/>
                 <w:color w:val="000000"/>
               </w:rPr>
-              <w:t xml:space="preserve">14.00 [6.00, 25.75]</w:t>
+              <w:t xml:space="preserve">14.00 [6.00, 25.25]</w:t>
             </w:r>
           </w:p>
         </w:tc>
@@ -6464,7 +6464,7 @@
                 <w:szCs w:val="18"/>
                 <w:color w:val="000000"/>
               </w:rPr>
-              <w:t xml:space="preserve">0.284</w:t>
+              <w:t xml:space="preserve">0.435</w:t>
             </w:r>
           </w:p>
         </w:tc>
@@ -6894,7 +6894,7 @@
                 <w:szCs w:val="18"/>
                 <w:color w:val="000000"/>
               </w:rPr>
-              <w:t xml:space="preserve">0.974</w:t>
+              <w:t xml:space="preserve">0.701</w:t>
             </w:r>
           </w:p>
         </w:tc>
@@ -7324,7 +7324,7 @@
                 <w:szCs w:val="18"/>
                 <w:color w:val="000000"/>
               </w:rPr>
-              <w:t xml:space="preserve">0.027</w:t>
+              <w:t xml:space="preserve">0.040</w:t>
             </w:r>
           </w:p>
         </w:tc>
@@ -7489,113 +7489,113 @@
                 <w:szCs w:val="18"/>
                 <w:color w:val="000000"/>
               </w:rPr>
-              <w:t xml:space="preserve">4.00 [1.00, 9.00]</w:t>
-            </w:r>
-          </w:p>
-        </w:tc>
-        <w:tc>
-          <w:tcPr>
-            <w:tcBorders>
-              <w:bottom w:val="single" w:sz="6" w:space="0" w:color="666666"/>
-              <w:top w:val="single" w:sz="6" w:space="0" w:color="666666"/>
-              <w:left w:val="none" w:sz="0" w:space="0" w:color="000000"/>
-              <w:right w:val="none" w:sz="0" w:space="0" w:color="000000"/>
-            </w:tcBorders>
-            <w:shd w:val="clear" w:color="auto" w:fill="FFFFFF"/>
-            <w:tcMar>
-              <w:top w:w="0" w:type="dxa"/>
-              <w:bottom w:w="0" w:type="dxa"/>
-              <w:left w:w="0" w:type="dxa"/>
-              <w:right w:w="0" w:type="dxa"/>
-            </w:tcMar>
-            <w:vAlign w:val="center"/>
-          </w:tcPr>
-          <w:p>
-            <w:pPr>
-              <w:pStyle w:val="Normal"/>
-              <w:jc w:val="left"/>
-              <w:pBdr>
-                <w:bottom w:val="none" w:sz="0" w:space="0" w:color="000000"/>
-                <w:top w:val="none" w:sz="0" w:space="0" w:color="000000"/>
-                <w:left w:val="none" w:sz="0" w:space="0" w:color="000000"/>
-                <w:right w:val="none" w:sz="0" w:space="0" w:color="000000"/>
-              </w:pBdr>
-              <w:spacing w:after="100" w:before="100" w:line="240"/>
-              <w:ind w:left="100" w:right="100" w:firstLine="0" w:firstLineChars="0"/>
-              <w:rPr>
-                <w:rFonts w:ascii="Arial" w:hAnsi="Arial" w:eastAsia="Arial" w:cs="Arial"/>
-                <w:i w:val="false"/>
-                <w:b w:val="false"/>
-                <w:u w:val="none"/>
-                <w:sz w:val="18"/>
-                <w:szCs w:val="18"/>
-                <w:color w:val="000000"/>
-              </w:rPr>
-            </w:pPr>
-            <w:r>
-              <w:rPr>
-                <w:rFonts w:ascii="Arial" w:hAnsi="Arial" w:eastAsia="Arial" w:cs="Arial"/>
-                <w:i w:val="false"/>
-                <w:b w:val="false"/>
-                <w:u w:val="none"/>
-                <w:sz w:val="18"/>
-                <w:szCs w:val="18"/>
-                <w:color w:val="000000"/>
-              </w:rPr>
-              <w:t xml:space="preserve">6.00 [2.00, 10.00]</w:t>
-            </w:r>
-          </w:p>
-        </w:tc>
-        <w:tc>
-          <w:tcPr>
-            <w:tcBorders>
-              <w:bottom w:val="single" w:sz="6" w:space="0" w:color="666666"/>
-              <w:top w:val="single" w:sz="6" w:space="0" w:color="666666"/>
-              <w:left w:val="none" w:sz="0" w:space="0" w:color="000000"/>
-              <w:right w:val="none" w:sz="0" w:space="0" w:color="000000"/>
-            </w:tcBorders>
-            <w:shd w:val="clear" w:color="auto" w:fill="FFFFFF"/>
-            <w:tcMar>
-              <w:top w:w="0" w:type="dxa"/>
-              <w:bottom w:w="0" w:type="dxa"/>
-              <w:left w:w="0" w:type="dxa"/>
-              <w:right w:w="0" w:type="dxa"/>
-            </w:tcMar>
-            <w:vAlign w:val="center"/>
-          </w:tcPr>
-          <w:p>
-            <w:pPr>
-              <w:pStyle w:val="Normal"/>
-              <w:jc w:val="left"/>
-              <w:pBdr>
-                <w:bottom w:val="none" w:sz="0" w:space="0" w:color="000000"/>
-                <w:top w:val="none" w:sz="0" w:space="0" w:color="000000"/>
-                <w:left w:val="none" w:sz="0" w:space="0" w:color="000000"/>
-                <w:right w:val="none" w:sz="0" w:space="0" w:color="000000"/>
-              </w:pBdr>
-              <w:spacing w:after="100" w:before="100" w:line="240"/>
-              <w:ind w:left="100" w:right="100" w:firstLine="0" w:firstLineChars="0"/>
-              <w:rPr>
-                <w:rFonts w:ascii="Arial" w:hAnsi="Arial" w:eastAsia="Arial" w:cs="Arial"/>
-                <w:i w:val="false"/>
-                <w:b w:val="false"/>
-                <w:u w:val="none"/>
-                <w:sz w:val="18"/>
-                <w:szCs w:val="18"/>
-                <w:color w:val="000000"/>
-              </w:rPr>
-            </w:pPr>
-            <w:r>
-              <w:rPr>
-                <w:rFonts w:ascii="Arial" w:hAnsi="Arial" w:eastAsia="Arial" w:cs="Arial"/>
-                <w:i w:val="false"/>
-                <w:b w:val="false"/>
-                <w:u w:val="none"/>
-                <w:sz w:val="18"/>
-                <w:szCs w:val="18"/>
-                <w:color w:val="000000"/>
-              </w:rPr>
-              <w:t xml:space="preserve">1.00 [0.00, 2.00]</w:t>
+              <w:t xml:space="preserve">4.00 [1.00, 9.50]</w:t>
+            </w:r>
+          </w:p>
+        </w:tc>
+        <w:tc>
+          <w:tcPr>
+            <w:tcBorders>
+              <w:bottom w:val="single" w:sz="6" w:space="0" w:color="666666"/>
+              <w:top w:val="single" w:sz="6" w:space="0" w:color="666666"/>
+              <w:left w:val="none" w:sz="0" w:space="0" w:color="000000"/>
+              <w:right w:val="none" w:sz="0" w:space="0" w:color="000000"/>
+            </w:tcBorders>
+            <w:shd w:val="clear" w:color="auto" w:fill="FFFFFF"/>
+            <w:tcMar>
+              <w:top w:w="0" w:type="dxa"/>
+              <w:bottom w:w="0" w:type="dxa"/>
+              <w:left w:w="0" w:type="dxa"/>
+              <w:right w:w="0" w:type="dxa"/>
+            </w:tcMar>
+            <w:vAlign w:val="center"/>
+          </w:tcPr>
+          <w:p>
+            <w:pPr>
+              <w:pStyle w:val="Normal"/>
+              <w:jc w:val="left"/>
+              <w:pBdr>
+                <w:bottom w:val="none" w:sz="0" w:space="0" w:color="000000"/>
+                <w:top w:val="none" w:sz="0" w:space="0" w:color="000000"/>
+                <w:left w:val="none" w:sz="0" w:space="0" w:color="000000"/>
+                <w:right w:val="none" w:sz="0" w:space="0" w:color="000000"/>
+              </w:pBdr>
+              <w:spacing w:after="100" w:before="100" w:line="240"/>
+              <w:ind w:left="100" w:right="100" w:firstLine="0" w:firstLineChars="0"/>
+              <w:rPr>
+                <w:rFonts w:ascii="Arial" w:hAnsi="Arial" w:eastAsia="Arial" w:cs="Arial"/>
+                <w:i w:val="false"/>
+                <w:b w:val="false"/>
+                <w:u w:val="none"/>
+                <w:sz w:val="18"/>
+                <w:szCs w:val="18"/>
+                <w:color w:val="000000"/>
+              </w:rPr>
+            </w:pPr>
+            <w:r>
+              <w:rPr>
+                <w:rFonts w:ascii="Arial" w:hAnsi="Arial" w:eastAsia="Arial" w:cs="Arial"/>
+                <w:i w:val="false"/>
+                <w:b w:val="false"/>
+                <w:u w:val="none"/>
+                <w:sz w:val="18"/>
+                <w:szCs w:val="18"/>
+                <w:color w:val="000000"/>
+              </w:rPr>
+              <w:t xml:space="preserve">6.00 [1.75, 10.00]</w:t>
+            </w:r>
+          </w:p>
+        </w:tc>
+        <w:tc>
+          <w:tcPr>
+            <w:tcBorders>
+              <w:bottom w:val="single" w:sz="6" w:space="0" w:color="666666"/>
+              <w:top w:val="single" w:sz="6" w:space="0" w:color="666666"/>
+              <w:left w:val="none" w:sz="0" w:space="0" w:color="000000"/>
+              <w:right w:val="none" w:sz="0" w:space="0" w:color="000000"/>
+            </w:tcBorders>
+            <w:shd w:val="clear" w:color="auto" w:fill="FFFFFF"/>
+            <w:tcMar>
+              <w:top w:w="0" w:type="dxa"/>
+              <w:bottom w:w="0" w:type="dxa"/>
+              <w:left w:w="0" w:type="dxa"/>
+              <w:right w:w="0" w:type="dxa"/>
+            </w:tcMar>
+            <w:vAlign w:val="center"/>
+          </w:tcPr>
+          <w:p>
+            <w:pPr>
+              <w:pStyle w:val="Normal"/>
+              <w:jc w:val="left"/>
+              <w:pBdr>
+                <w:bottom w:val="none" w:sz="0" w:space="0" w:color="000000"/>
+                <w:top w:val="none" w:sz="0" w:space="0" w:color="000000"/>
+                <w:left w:val="none" w:sz="0" w:space="0" w:color="000000"/>
+                <w:right w:val="none" w:sz="0" w:space="0" w:color="000000"/>
+              </w:pBdr>
+              <w:spacing w:after="100" w:before="100" w:line="240"/>
+              <w:ind w:left="100" w:right="100" w:firstLine="0" w:firstLineChars="0"/>
+              <w:rPr>
+                <w:rFonts w:ascii="Arial" w:hAnsi="Arial" w:eastAsia="Arial" w:cs="Arial"/>
+                <w:i w:val="false"/>
+                <w:b w:val="false"/>
+                <w:u w:val="none"/>
+                <w:sz w:val="18"/>
+                <w:szCs w:val="18"/>
+                <w:color w:val="000000"/>
+              </w:rPr>
+            </w:pPr>
+            <w:r>
+              <w:rPr>
+                <w:rFonts w:ascii="Arial" w:hAnsi="Arial" w:eastAsia="Arial" w:cs="Arial"/>
+                <w:i w:val="false"/>
+                <w:b w:val="false"/>
+                <w:u w:val="none"/>
+                <w:sz w:val="18"/>
+                <w:szCs w:val="18"/>
+                <w:color w:val="000000"/>
+              </w:rPr>
+              <w:t xml:space="preserve">1.00 [0.00, 2.50]</w:t>
             </w:r>
           </w:p>
         </w:tc>
@@ -7754,7 +7754,7 @@
                 <w:szCs w:val="18"/>
                 <w:color w:val="000000"/>
               </w:rPr>
-              <w:t xml:space="preserve">0.229</w:t>
+              <w:t xml:space="preserve">0.336</w:t>
             </w:r>
           </w:p>
         </w:tc>
@@ -8078,7 +8078,7 @@
                 <w:szCs w:val="18"/>
                 <w:color w:val="000000"/>
               </w:rPr>
-              <w:t xml:space="preserve">0.019</w:t>
+              <w:t xml:space="preserve">0.010</w:t>
             </w:r>
           </w:p>
         </w:tc>
@@ -8184,7 +8184,7 @@
                 <w:szCs w:val="18"/>
                 <w:color w:val="000000"/>
               </w:rPr>
-              <w:t xml:space="preserve">0.120</w:t>
+              <w:t xml:space="preserve">0.101</w:t>
             </w:r>
           </w:p>
         </w:tc>
@@ -8508,7 +8508,7 @@
                 <w:szCs w:val="18"/>
                 <w:color w:val="000000"/>
               </w:rPr>
-              <w:t xml:space="preserve">0.001</w:t>
+              <w:t xml:space="preserve">&lt;0.001</w:t>
             </w:r>
           </w:p>
         </w:tc>
@@ -8614,7 +8614,7 @@
                 <w:szCs w:val="18"/>
                 <w:color w:val="000000"/>
               </w:rPr>
-              <w:t xml:space="preserve">0.266</w:t>
+              <w:t xml:space="preserve">0.135</w:t>
             </w:r>
           </w:p>
         </w:tc>
@@ -8885,60 +8885,60 @@
                 <w:szCs w:val="18"/>
                 <w:color w:val="000000"/>
               </w:rPr>
-              <w:t xml:space="preserve">5.00 [5.00, 7.00]</w:t>
-            </w:r>
-          </w:p>
-        </w:tc>
-        <w:tc>
-          <w:tcPr>
-            <w:tcBorders>
-              <w:bottom w:val="single" w:sz="6" w:space="0" w:color="666666"/>
-              <w:top w:val="single" w:sz="6" w:space="0" w:color="666666"/>
-              <w:left w:val="none" w:sz="0" w:space="0" w:color="000000"/>
-              <w:right w:val="none" w:sz="0" w:space="0" w:color="000000"/>
-            </w:tcBorders>
-            <w:shd w:val="clear" w:color="auto" w:fill="FFFFFF"/>
-            <w:tcMar>
-              <w:top w:w="0" w:type="dxa"/>
-              <w:bottom w:w="0" w:type="dxa"/>
-              <w:left w:w="0" w:type="dxa"/>
-              <w:right w:w="0" w:type="dxa"/>
-            </w:tcMar>
-            <w:vAlign w:val="center"/>
-          </w:tcPr>
-          <w:p>
-            <w:pPr>
-              <w:pStyle w:val="Normal"/>
-              <w:jc w:val="left"/>
-              <w:pBdr>
-                <w:bottom w:val="none" w:sz="0" w:space="0" w:color="000000"/>
-                <w:top w:val="none" w:sz="0" w:space="0" w:color="000000"/>
-                <w:left w:val="none" w:sz="0" w:space="0" w:color="000000"/>
-                <w:right w:val="none" w:sz="0" w:space="0" w:color="000000"/>
-              </w:pBdr>
-              <w:spacing w:after="100" w:before="100" w:line="240"/>
-              <w:ind w:left="100" w:right="100" w:firstLine="0" w:firstLineChars="0"/>
-              <w:rPr>
-                <w:rFonts w:ascii="Arial" w:hAnsi="Arial" w:eastAsia="Arial" w:cs="Arial"/>
-                <w:i w:val="false"/>
-                <w:b w:val="false"/>
-                <w:u w:val="none"/>
-                <w:sz w:val="18"/>
-                <w:szCs w:val="18"/>
-                <w:color w:val="000000"/>
-              </w:rPr>
-            </w:pPr>
-            <w:r>
-              <w:rPr>
-                <w:rFonts w:ascii="Arial" w:hAnsi="Arial" w:eastAsia="Arial" w:cs="Arial"/>
-                <w:i w:val="false"/>
-                <w:b w:val="false"/>
-                <w:u w:val="none"/>
-                <w:sz w:val="18"/>
-                <w:szCs w:val="18"/>
-                <w:color w:val="000000"/>
-              </w:rPr>
-              <w:t xml:space="preserve">0.625</w:t>
+              <w:t xml:space="preserve">6.00 [5.00, 7.00]</w:t>
+            </w:r>
+          </w:p>
+        </w:tc>
+        <w:tc>
+          <w:tcPr>
+            <w:tcBorders>
+              <w:bottom w:val="single" w:sz="6" w:space="0" w:color="666666"/>
+              <w:top w:val="single" w:sz="6" w:space="0" w:color="666666"/>
+              <w:left w:val="none" w:sz="0" w:space="0" w:color="000000"/>
+              <w:right w:val="none" w:sz="0" w:space="0" w:color="000000"/>
+            </w:tcBorders>
+            <w:shd w:val="clear" w:color="auto" w:fill="FFFFFF"/>
+            <w:tcMar>
+              <w:top w:w="0" w:type="dxa"/>
+              <w:bottom w:w="0" w:type="dxa"/>
+              <w:left w:w="0" w:type="dxa"/>
+              <w:right w:w="0" w:type="dxa"/>
+            </w:tcMar>
+            <w:vAlign w:val="center"/>
+          </w:tcPr>
+          <w:p>
+            <w:pPr>
+              <w:pStyle w:val="Normal"/>
+              <w:jc w:val="left"/>
+              <w:pBdr>
+                <w:bottom w:val="none" w:sz="0" w:space="0" w:color="000000"/>
+                <w:top w:val="none" w:sz="0" w:space="0" w:color="000000"/>
+                <w:left w:val="none" w:sz="0" w:space="0" w:color="000000"/>
+                <w:right w:val="none" w:sz="0" w:space="0" w:color="000000"/>
+              </w:pBdr>
+              <w:spacing w:after="100" w:before="100" w:line="240"/>
+              <w:ind w:left="100" w:right="100" w:firstLine="0" w:firstLineChars="0"/>
+              <w:rPr>
+                <w:rFonts w:ascii="Arial" w:hAnsi="Arial" w:eastAsia="Arial" w:cs="Arial"/>
+                <w:i w:val="false"/>
+                <w:b w:val="false"/>
+                <w:u w:val="none"/>
+                <w:sz w:val="18"/>
+                <w:szCs w:val="18"/>
+                <w:color w:val="000000"/>
+              </w:rPr>
+            </w:pPr>
+            <w:r>
+              <w:rPr>
+                <w:rFonts w:ascii="Arial" w:hAnsi="Arial" w:eastAsia="Arial" w:cs="Arial"/>
+                <w:i w:val="false"/>
+                <w:b w:val="false"/>
+                <w:u w:val="none"/>
+                <w:sz w:val="18"/>
+                <w:szCs w:val="18"/>
+                <w:color w:val="000000"/>
+              </w:rPr>
+              <w:t xml:space="preserve">0.552</w:t>
             </w:r>
           </w:p>
         </w:tc>
@@ -9044,7 +9044,7 @@
                 <w:szCs w:val="18"/>
                 <w:color w:val="000000"/>
               </w:rPr>
-              <w:t xml:space="preserve">0.473</w:t>
+              <w:t xml:space="preserve">0.444</w:t>
             </w:r>
           </w:p>
         </w:tc>
@@ -9262,7 +9262,7 @@
                 <w:szCs w:val="18"/>
                 <w:color w:val="000000"/>
               </w:rPr>
-              <w:t xml:space="preserve">2.00 [0.00, 4.00]</w:t>
+              <w:t xml:space="preserve">1.00 [0.00, 4.00]</w:t>
             </w:r>
           </w:p>
         </w:tc>
@@ -9368,7 +9368,7 @@
                 <w:szCs w:val="18"/>
                 <w:color w:val="000000"/>
               </w:rPr>
-              <w:t xml:space="preserve">0.085</w:t>
+              <w:t xml:space="preserve">0.098</w:t>
             </w:r>
           </w:p>
         </w:tc>
@@ -9474,7 +9474,7 @@
                 <w:szCs w:val="18"/>
                 <w:color w:val="000000"/>
               </w:rPr>
-              <w:t xml:space="preserve">0.098</w:t>
+              <w:t xml:space="preserve">0.151</w:t>
             </w:r>
           </w:p>
         </w:tc>
@@ -10499,7 +10499,7 @@
                 <w:szCs w:val="18"/>
                 <w:color w:val="000000"/>
               </w:rPr>
-              <w:t xml:space="preserve">3.00 [2.00, 5.00]</w:t>
+              <w:t xml:space="preserve">3.00 [2.00, 6.00]</w:t>
             </w:r>
           </w:p>
         </w:tc>
@@ -10929,7 +10929,7 @@
                 <w:szCs w:val="18"/>
                 <w:color w:val="000000"/>
               </w:rPr>
-              <w:t xml:space="preserve">7.00 [3.00, 12.00]</w:t>
+              <w:t xml:space="preserve">7.00 [4.00, 12.00]</w:t>
             </w:r>
           </w:p>
         </w:tc>
@@ -10982,7 +10982,7 @@
                 <w:szCs w:val="18"/>
                 <w:color w:val="000000"/>
               </w:rPr>
-              <w:t xml:space="preserve">10.00 [6.00, 16.00]</w:t>
+              <w:t xml:space="preserve">10.00 [6.00, 16.25]</w:t>
             </w:r>
           </w:p>
         </w:tc>
@@ -11194,7 +11194,7 @@
                 <w:szCs w:val="18"/>
                 <w:color w:val="000000"/>
               </w:rPr>
-              <w:t xml:space="preserve">&lt;0.001</w:t>
+              <w:t xml:space="preserve">0.001</w:t>
             </w:r>
           </w:p>
         </w:tc>

</xml_diff>